<commit_message>
Knowledge - 1-Academic - fix sources - 11/7/2025
</commit_message>
<xml_diff>
--- a/Knowledge/1-Academic/1-school/1-Kg 1/Source.docx
+++ b/Knowledge/1-Academic/1-school/1-Kg 1/Source.docx
@@ -24,21 +24,33 @@
         <w:t xml:space="preserve">: </w:t>
       </w:r>
       <w:r>
+        <w:t>[</w:t>
+      </w:r>
+      <w:r>
         <w:t>b2f20721-05f6-4358-8783-b5f03790974b</w:t>
       </w:r>
       <w:r>
-        <w:t xml:space="preserve"> </w:t>
-      </w:r>
-      <w:r>
-        <w:t>-&gt;</w:t>
-      </w:r>
-      <w:r>
-        <w:t xml:space="preserve"> </w:t>
+        <w:t>.pdf</w:t>
+      </w:r>
+      <w:r>
+        <w:t xml:space="preserve"> -&gt; </w:t>
       </w:r>
       <w:r>
         <w:t>Discover - Arabic - Kg 1 - First Semester</w:t>
       </w:r>
       <w:r>
+        <w:t>.pdf</w:t>
+      </w:r>
+      <w:r>
+        <w:t>] [</w:t>
+      </w:r>
+      <w:r>
+        <w:t>Discover - Arabic - Kg 1 - First Semester</w:t>
+      </w:r>
+      <w:r>
+        <w:t>]</w:t>
+      </w:r>
+      <w:r>
         <w:br/>
       </w:r>
       <w:r>
@@ -71,6 +83,28 @@
       </w:r>
       <w:r>
         <w:t>: Educational</w:t>
+      </w:r>
+      <w:r>
+        <w:rPr>
+          <w:rtl/>
+        </w:rPr>
+        <w:br/>
+      </w:r>
+      <w:r>
+        <w:t xml:space="preserve">* </w:t>
+      </w:r>
+      <w:r>
+        <w:rPr>
+          <w:b/>
+          <w:bCs/>
+        </w:rPr>
+        <w:t>Source Platform</w:t>
+      </w:r>
+      <w:r>
+        <w:t xml:space="preserve">: </w:t>
+      </w:r>
+      <w:r>
+        <w:t>Egyptian Ministry of Education – E-Learning Portal (https://moe.gov.eg)</w:t>
       </w:r>
     </w:p>
     <w:p>
@@ -125,6 +159,38 @@
     <w:p>
       <w:pPr>
         <w:ind w:left="720"/>
+        <w:rPr>
+          <w:rtl/>
+          <w:lang w:bidi="ar-EG"/>
+        </w:rPr>
+      </w:pPr>
+      <w:r>
+        <w:t xml:space="preserve">* </w:t>
+      </w:r>
+      <w:r>
+        <w:rPr>
+          <w:b/>
+          <w:bCs/>
+        </w:rPr>
+        <w:t xml:space="preserve">Download </w:t>
+      </w:r>
+      <w:r>
+        <w:rPr>
+          <w:b/>
+          <w:bCs/>
+        </w:rPr>
+        <w:t>Server / Mirror</w:t>
+      </w:r>
+      <w:r>
+        <w:t xml:space="preserve">: </w:t>
+      </w:r>
+      <w:r>
+        <w:t>https://elearnningcontent.blob.core.windows.net [Microsoft Azure Blob Storage Server]</w:t>
+      </w:r>
+    </w:p>
+    <w:p>
+      <w:pPr>
+        <w:ind w:left="720"/>
       </w:pPr>
       <w:r>
         <w:t xml:space="preserve">* </w:t>
@@ -140,7 +206,7 @@
         <w:t xml:space="preserve">: </w:t>
       </w:r>
       <w:r>
-        <w:t>Browser</w:t>
+        <w:t>Web Browser: Direct Save [Saved pdf directly from browser]</w:t>
       </w:r>
     </w:p>
     <w:p>
@@ -207,18 +273,15 @@
       <w:r>
         <w:rPr>
           <w:b/>
-          <w:bCs/>
         </w:rPr>
         <w:t>Saved Location</w:t>
       </w:r>
       <w:r>
-        <w:t>: toonkingdomelbaf2/Academic</w:t>
-      </w:r>
-      <w:proofErr w:type="gramStart"/>
-      <w:r>
-        <w:t>/..</w:t>
-      </w:r>
-      <w:proofErr w:type="gramEnd"/>
+        <w:t xml:space="preserve">: </w:t>
+      </w:r>
+      <w:r>
+        <w:t>StorageType: Cloud -&gt; Platform: GitHub -&gt; Account: topicsscience -&gt; Repository: kingdomheartsknowledge -&gt; Path: Knowledge/1-Academic/1-school/..</w:t>
+      </w:r>
     </w:p>
     <w:p>
       <w:pPr>
@@ -251,9 +314,9 @@
       </w:r>
     </w:p>
     <w:p>
-      <w:pPr>
-        <w:ind w:firstLine="720"/>
-      </w:pPr>
+      <w:r>
+        <w:br w:type="page"/>
+      </w:r>
     </w:p>
     <w:p>
       <w:pPr>
@@ -264,6 +327,7 @@
         </w:numPr>
       </w:pPr>
       <w:r>
+        <w:lastRenderedPageBreak/>
         <w:t xml:space="preserve">* </w:t>
       </w:r>
       <w:r>
@@ -277,18 +341,36 @@
         <w:t xml:space="preserve">: </w:t>
       </w:r>
       <w:r>
+        <w:t>[</w:t>
+      </w:r>
+      <w:r>
         <w:t>0d6c8868-e136-4f58-b070-d27a98ce6a99</w:t>
       </w:r>
       <w:r>
-        <w:t xml:space="preserve"> </w:t>
-      </w:r>
-      <w:r>
-        <w:t xml:space="preserve">-&gt; </w:t>
+        <w:t>.pdf</w:t>
+      </w:r>
+      <w:r>
+        <w:t xml:space="preserve"> -&gt; </w:t>
       </w:r>
       <w:r>
         <w:t>Discover - English - Kg 1 - First Semester</w:t>
       </w:r>
       <w:r>
+        <w:t>.pdf</w:t>
+      </w:r>
+      <w:r>
+        <w:t>]</w:t>
+      </w:r>
+      <w:r>
+        <w:t xml:space="preserve"> [</w:t>
+      </w:r>
+      <w:r>
+        <w:t>Discover - English - Kg 1 - First Semester</w:t>
+      </w:r>
+      <w:r>
+        <w:t>]</w:t>
+      </w:r>
+      <w:r>
         <w:br/>
       </w:r>
       <w:r>
@@ -321,6 +403,28 @@
       </w:r>
       <w:r>
         <w:t>: Educational</w:t>
+      </w:r>
+      <w:r>
+        <w:rPr>
+          <w:rtl/>
+        </w:rPr>
+        <w:br/>
+      </w:r>
+      <w:r>
+        <w:t xml:space="preserve">* </w:t>
+      </w:r>
+      <w:r>
+        <w:rPr>
+          <w:b/>
+          <w:bCs/>
+        </w:rPr>
+        <w:t>Source Platform</w:t>
+      </w:r>
+      <w:r>
+        <w:t xml:space="preserve">: </w:t>
+      </w:r>
+      <w:r>
+        <w:t>Egyptian Ministry of Education – E-Learning Portal (https://moe.gov.eg)</w:t>
       </w:r>
     </w:p>
     <w:p>
@@ -366,6 +470,38 @@
     <w:p>
       <w:pPr>
         <w:ind w:left="720"/>
+        <w:rPr>
+          <w:rtl/>
+          <w:lang w:bidi="ar-EG"/>
+        </w:rPr>
+      </w:pPr>
+      <w:r>
+        <w:t xml:space="preserve">* </w:t>
+      </w:r>
+      <w:r>
+        <w:rPr>
+          <w:b/>
+          <w:bCs/>
+        </w:rPr>
+        <w:t xml:space="preserve">Download </w:t>
+      </w:r>
+      <w:r>
+        <w:rPr>
+          <w:b/>
+          <w:bCs/>
+        </w:rPr>
+        <w:t>Server / Mirror</w:t>
+      </w:r>
+      <w:r>
+        <w:t xml:space="preserve">: </w:t>
+      </w:r>
+      <w:r>
+        <w:t>https://elearnningcontent.blob.core.windows.net [Microsoft Azure Blob Storage Server]</w:t>
+      </w:r>
+    </w:p>
+    <w:p>
+      <w:pPr>
+        <w:ind w:left="720"/>
       </w:pPr>
       <w:r>
         <w:t xml:space="preserve">* </w:t>
@@ -378,7 +514,10 @@
         <w:t>Download Method</w:t>
       </w:r>
       <w:r>
-        <w:t>: Browser</w:t>
+        <w:t xml:space="preserve">: </w:t>
+      </w:r>
+      <w:r>
+        <w:t>Web Browser: Direct Save [Saved pdf directly from browser]</w:t>
       </w:r>
     </w:p>
     <w:p>
@@ -445,25 +584,21 @@
       <w:r>
         <w:rPr>
           <w:b/>
-          <w:bCs/>
         </w:rPr>
         <w:t>Saved Location</w:t>
       </w:r>
       <w:r>
-        <w:t>: toonkingdomelbaf2/Academic</w:t>
-      </w:r>
-      <w:proofErr w:type="gramStart"/>
-      <w:r>
-        <w:t>/..</w:t>
-      </w:r>
-      <w:proofErr w:type="gramEnd"/>
+        <w:t xml:space="preserve">: </w:t>
+      </w:r>
+      <w:r>
+        <w:t>StorageType: Cloud -&gt; Platform: GitHub -&gt; Account: topicsscience -&gt; Repository: kingdomheartsknowledge -&gt; Path: Knowledge/1-Academic/1-school/..</w:t>
+      </w:r>
     </w:p>
     <w:p>
       <w:pPr>
         <w:ind w:firstLine="720"/>
       </w:pPr>
       <w:r>
-        <w:lastRenderedPageBreak/>
         <w:t xml:space="preserve">* </w:t>
       </w:r>
       <w:r>
@@ -494,7 +629,11 @@
         <w:ind w:firstLine="720"/>
       </w:pPr>
     </w:p>
-    <w:p/>
+    <w:p>
+      <w:r>
+        <w:br w:type="page"/>
+      </w:r>
+    </w:p>
     <w:p>
       <w:pPr>
         <w:pStyle w:val="ListParagraph"/>
@@ -504,6 +643,7 @@
         </w:numPr>
       </w:pPr>
       <w:r>
+        <w:lastRenderedPageBreak/>
         <w:t xml:space="preserve">* </w:t>
       </w:r>
       <w:r>
@@ -517,7 +657,31 @@
         <w:t xml:space="preserve">: </w:t>
       </w:r>
       <w:r>
-        <w:t xml:space="preserve">d5e5f430-fbb8-4d58-86c8-a917fa7fe8a3 -&gt; Discover - French - Kg 1 - First Semester </w:t>
+        <w:t>[</w:t>
+      </w:r>
+      <w:r>
+        <w:t>d5e5f430-fbb8-4d58-86c8-a917fa7fe8a3</w:t>
+      </w:r>
+      <w:r>
+        <w:t>.pdf</w:t>
+      </w:r>
+      <w:r>
+        <w:t xml:space="preserve"> -&gt; Discover - French - Kg 1 - First Semester</w:t>
+      </w:r>
+      <w:r>
+        <w:t>.pdf</w:t>
+      </w:r>
+      <w:r>
+        <w:t>]</w:t>
+      </w:r>
+      <w:r>
+        <w:t xml:space="preserve"> [</w:t>
+      </w:r>
+      <w:r>
+        <w:t>Discover - French - Kg 1 - First Semester</w:t>
+      </w:r>
+      <w:r>
+        <w:t>]</w:t>
       </w:r>
       <w:r>
         <w:br/>
@@ -550,6 +714,28 @@
       </w:r>
       <w:r>
         <w:t>: Educational</w:t>
+      </w:r>
+      <w:r>
+        <w:rPr>
+          <w:rtl/>
+        </w:rPr>
+        <w:br/>
+      </w:r>
+      <w:r>
+        <w:t xml:space="preserve">* </w:t>
+      </w:r>
+      <w:r>
+        <w:rPr>
+          <w:b/>
+          <w:bCs/>
+        </w:rPr>
+        <w:t>Source Platform</w:t>
+      </w:r>
+      <w:r>
+        <w:t xml:space="preserve">: </w:t>
+      </w:r>
+      <w:r>
+        <w:t>Egyptian Ministry of Education – E-Learning Portal (https://moe.gov.eg)</w:t>
       </w:r>
     </w:p>
     <w:p>
@@ -598,6 +784,38 @@
     <w:p>
       <w:pPr>
         <w:ind w:left="720"/>
+        <w:rPr>
+          <w:rtl/>
+          <w:lang w:bidi="ar-EG"/>
+        </w:rPr>
+      </w:pPr>
+      <w:r>
+        <w:t xml:space="preserve">* </w:t>
+      </w:r>
+      <w:r>
+        <w:rPr>
+          <w:b/>
+          <w:bCs/>
+        </w:rPr>
+        <w:t xml:space="preserve">Download </w:t>
+      </w:r>
+      <w:r>
+        <w:rPr>
+          <w:b/>
+          <w:bCs/>
+        </w:rPr>
+        <w:t>Server / Mirror</w:t>
+      </w:r>
+      <w:r>
+        <w:t xml:space="preserve">: </w:t>
+      </w:r>
+      <w:r>
+        <w:t>https://elearnningcontent.blob.core.windows.net [Microsoft Azure Blob Storage Server]</w:t>
+      </w:r>
+    </w:p>
+    <w:p>
+      <w:pPr>
+        <w:ind w:left="720"/>
       </w:pPr>
       <w:r>
         <w:t xml:space="preserve">* </w:t>
@@ -610,7 +828,10 @@
         <w:t>Download Method</w:t>
       </w:r>
       <w:r>
-        <w:t>: Browser</w:t>
+        <w:t xml:space="preserve">: </w:t>
+      </w:r>
+      <w:r>
+        <w:t>Web Browser: Direct Save [Saved pdf directly from browser]</w:t>
       </w:r>
     </w:p>
     <w:p>
@@ -677,18 +898,15 @@
       <w:r>
         <w:rPr>
           <w:b/>
-          <w:bCs/>
         </w:rPr>
         <w:t>Saved Location</w:t>
       </w:r>
       <w:r>
-        <w:t>: toonkingdomelbaf2/Academic</w:t>
-      </w:r>
-      <w:proofErr w:type="gramStart"/>
-      <w:r>
-        <w:t>/..</w:t>
-      </w:r>
-      <w:proofErr w:type="gramEnd"/>
+        <w:t xml:space="preserve">: </w:t>
+      </w:r>
+      <w:r>
+        <w:t>StorageType: Cloud -&gt; Platform: GitHub -&gt; Account: topicsscience -&gt; Repository: kingdomheartsknowledge -&gt; Path: Knowledge/1-Academic/1-school/..</w:t>
+      </w:r>
     </w:p>
     <w:p>
       <w:pPr>
@@ -779,7 +997,6 @@
         </w:numPr>
       </w:pPr>
       <w:r>
-        <w:lastRenderedPageBreak/>
         <w:t xml:space="preserve">* </w:t>
       </w:r>
       <w:r>
@@ -793,9 +1010,15 @@
         <w:t xml:space="preserve">: </w:t>
       </w:r>
       <w:r>
+        <w:t>[</w:t>
+      </w:r>
+      <w:r>
         <w:t>d18651cb-45ff-49b2-a275-976514daf3ae</w:t>
       </w:r>
       <w:r>
+        <w:t>.pdf</w:t>
+      </w:r>
+      <w:r>
         <w:t xml:space="preserve"> </w:t>
       </w:r>
       <w:r>
@@ -805,6 +1028,21 @@
         <w:t>Arabic - Kg 1 - First Semester</w:t>
       </w:r>
       <w:r>
+        <w:t>.pdf</w:t>
+      </w:r>
+      <w:r>
+        <w:t>]</w:t>
+      </w:r>
+      <w:r>
+        <w:t xml:space="preserve"> [</w:t>
+      </w:r>
+      <w:r>
+        <w:t>Arabic - Kg 1 - First Semester</w:t>
+      </w:r>
+      <w:r>
+        <w:t>]</w:t>
+      </w:r>
+      <w:r>
         <w:br/>
       </w:r>
       <w:r>
@@ -837,6 +1075,28 @@
       </w:r>
       <w:r>
         <w:t>: Educational</w:t>
+      </w:r>
+      <w:r>
+        <w:rPr>
+          <w:rtl/>
+        </w:rPr>
+        <w:br/>
+      </w:r>
+      <w:r>
+        <w:t xml:space="preserve">* </w:t>
+      </w:r>
+      <w:r>
+        <w:rPr>
+          <w:b/>
+          <w:bCs/>
+        </w:rPr>
+        <w:t>Source Platform</w:t>
+      </w:r>
+      <w:r>
+        <w:t xml:space="preserve">: </w:t>
+      </w:r>
+      <w:r>
+        <w:t>Egyptian Ministry of Education – E-Learning Portal (https://moe.gov.eg)</w:t>
       </w:r>
     </w:p>
     <w:p>
@@ -885,6 +1145,38 @@
     <w:p>
       <w:pPr>
         <w:ind w:left="720"/>
+        <w:rPr>
+          <w:rtl/>
+          <w:lang w:bidi="ar-EG"/>
+        </w:rPr>
+      </w:pPr>
+      <w:r>
+        <w:t xml:space="preserve">* </w:t>
+      </w:r>
+      <w:r>
+        <w:rPr>
+          <w:b/>
+          <w:bCs/>
+        </w:rPr>
+        <w:t xml:space="preserve">Download </w:t>
+      </w:r>
+      <w:r>
+        <w:rPr>
+          <w:b/>
+          <w:bCs/>
+        </w:rPr>
+        <w:t>Server / Mirror</w:t>
+      </w:r>
+      <w:r>
+        <w:t xml:space="preserve">: </w:t>
+      </w:r>
+      <w:r>
+        <w:t>https://elearnningcontent.blob.core.windows.net [Microsoft Azure Blob Storage Server]</w:t>
+      </w:r>
+    </w:p>
+    <w:p>
+      <w:pPr>
+        <w:ind w:left="720"/>
       </w:pPr>
       <w:r>
         <w:t xml:space="preserve">* </w:t>
@@ -897,7 +1189,10 @@
         <w:t>Download Method</w:t>
       </w:r>
       <w:r>
-        <w:t>: Browser</w:t>
+        <w:t xml:space="preserve">: </w:t>
+      </w:r>
+      <w:r>
+        <w:t>Web Browser: Direct Save [Saved pdf directly from browser]</w:t>
       </w:r>
     </w:p>
     <w:p>
@@ -964,18 +1259,15 @@
       <w:r>
         <w:rPr>
           <w:b/>
-          <w:bCs/>
         </w:rPr>
         <w:t>Saved Location</w:t>
       </w:r>
       <w:r>
-        <w:t>: toonkingdomelbaf2/Academic</w:t>
-      </w:r>
-      <w:proofErr w:type="gramStart"/>
-      <w:r>
-        <w:t>/..</w:t>
-      </w:r>
-      <w:proofErr w:type="gramEnd"/>
+        <w:t xml:space="preserve">: </w:t>
+      </w:r>
+      <w:r>
+        <w:t>StorageType: Cloud -&gt; Platform: GitHub -&gt; Account: topicsscience -&gt; Repository: kingdomheartsknowledge -&gt; Path: Knowledge/1-Academic/1-school/..</w:t>
+      </w:r>
     </w:p>
     <w:p>
       <w:pPr>
@@ -1008,9 +1300,9 @@
       </w:r>
     </w:p>
     <w:p>
-      <w:pPr>
-        <w:ind w:firstLine="720"/>
-      </w:pPr>
+      <w:r>
+        <w:br w:type="page"/>
+      </w:r>
     </w:p>
     <w:p>
       <w:pPr>
@@ -1021,6 +1313,7 @@
         </w:numPr>
       </w:pPr>
       <w:r>
+        <w:lastRenderedPageBreak/>
         <w:t xml:space="preserve">* </w:t>
       </w:r>
       <w:r>
@@ -1034,13 +1327,37 @@
         <w:t xml:space="preserve">: </w:t>
       </w:r>
       <w:r>
-        <w:t xml:space="preserve">24075d65-0c34-4d20-9234-7c24f42b758d </w:t>
+        <w:t>[</w:t>
+      </w:r>
+      <w:r>
+        <w:t>24075d65-0c34-4d20-9234-7c24f42b758d</w:t>
+      </w:r>
+      <w:r>
+        <w:t>.pdf</w:t>
+      </w:r>
+      <w:r>
+        <w:t xml:space="preserve"> </w:t>
       </w:r>
       <w:r>
         <w:t xml:space="preserve">-&gt; </w:t>
       </w:r>
       <w:r>
-        <w:t xml:space="preserve">English - Kg 1 - First Semester </w:t>
+        <w:t>English - Kg 1 - First Semester</w:t>
+      </w:r>
+      <w:r>
+        <w:t>.pdf</w:t>
+      </w:r>
+      <w:r>
+        <w:t>]</w:t>
+      </w:r>
+      <w:r>
+        <w:t xml:space="preserve"> [</w:t>
+      </w:r>
+      <w:r>
+        <w:t>English - Kg 1 - First Semester</w:t>
+      </w:r>
+      <w:r>
+        <w:t>]</w:t>
       </w:r>
       <w:r>
         <w:br/>
@@ -1075,6 +1392,28 @@
       </w:r>
       <w:r>
         <w:t>: Educational</w:t>
+      </w:r>
+      <w:r>
+        <w:rPr>
+          <w:rtl/>
+        </w:rPr>
+        <w:br/>
+      </w:r>
+      <w:r>
+        <w:t xml:space="preserve">* </w:t>
+      </w:r>
+      <w:r>
+        <w:rPr>
+          <w:b/>
+          <w:bCs/>
+        </w:rPr>
+        <w:t>Source Platform</w:t>
+      </w:r>
+      <w:r>
+        <w:t xml:space="preserve">: </w:t>
+      </w:r>
+      <w:r>
+        <w:t>Egyptian Ministry of Education – E-Learning Portal (https://moe.gov.eg)</w:t>
       </w:r>
     </w:p>
     <w:p>
@@ -1120,6 +1459,38 @@
     <w:p>
       <w:pPr>
         <w:ind w:left="720"/>
+        <w:rPr>
+          <w:rtl/>
+          <w:lang w:bidi="ar-EG"/>
+        </w:rPr>
+      </w:pPr>
+      <w:r>
+        <w:t xml:space="preserve">* </w:t>
+      </w:r>
+      <w:r>
+        <w:rPr>
+          <w:b/>
+          <w:bCs/>
+        </w:rPr>
+        <w:t xml:space="preserve">Download </w:t>
+      </w:r>
+      <w:r>
+        <w:rPr>
+          <w:b/>
+          <w:bCs/>
+        </w:rPr>
+        <w:t>Server / Mirror</w:t>
+      </w:r>
+      <w:r>
+        <w:t xml:space="preserve">: </w:t>
+      </w:r>
+      <w:r>
+        <w:t>https://elearnningcontent.blob.core.windows.net [Microsoft Azure Blob Storage Server]</w:t>
+      </w:r>
+    </w:p>
+    <w:p>
+      <w:pPr>
+        <w:ind w:left="720"/>
       </w:pPr>
       <w:r>
         <w:t xml:space="preserve">* </w:t>
@@ -1132,7 +1503,10 @@
         <w:t>Download Method</w:t>
       </w:r>
       <w:r>
-        <w:t>: Browser</w:t>
+        <w:t xml:space="preserve">: </w:t>
+      </w:r>
+      <w:r>
+        <w:t>Web Browser: Direct Save [Saved pdf directly from browser]</w:t>
       </w:r>
     </w:p>
     <w:p>
@@ -1199,25 +1573,21 @@
       <w:r>
         <w:rPr>
           <w:b/>
-          <w:bCs/>
         </w:rPr>
         <w:t>Saved Location</w:t>
       </w:r>
       <w:r>
-        <w:t>: toonkingdomelbaf2/Academic</w:t>
-      </w:r>
-      <w:proofErr w:type="gramStart"/>
-      <w:r>
-        <w:t>/..</w:t>
-      </w:r>
-      <w:proofErr w:type="gramEnd"/>
+        <w:t xml:space="preserve">: </w:t>
+      </w:r>
+      <w:r>
+        <w:t>StorageType: Cloud -&gt; Platform: GitHub -&gt; Account: topicsscience -&gt; Repository: kingdomheartsknowledge -&gt; Path: Knowledge/1-Academic/1-school/..</w:t>
+      </w:r>
     </w:p>
     <w:p>
       <w:pPr>
         <w:ind w:firstLine="720"/>
       </w:pPr>
       <w:r>
-        <w:lastRenderedPageBreak/>
         <w:t xml:space="preserve">* </w:t>
       </w:r>
       <w:r>
@@ -2240,7 +2610,7 @@
   <w:style w:type="paragraph" w:default="1" w:styleId="Normal">
     <w:name w:val="Normal"/>
     <w:qFormat/>
-    <w:rsid w:val="00EF1E06"/>
+    <w:rsid w:val="004F71E7"/>
   </w:style>
   <w:style w:type="paragraph" w:styleId="Heading1">
     <w:name w:val="heading 1"/>

</xml_diff>

<commit_message>
Knowledge - 1-Academic - 11/16/2025
</commit_message>
<xml_diff>
--- a/Knowledge/1-Academic/1-school/1-Kg 1/Source.docx
+++ b/Knowledge/1-Academic/1-school/1-Kg 1/Source.docx
@@ -11,57 +11,53 @@
         </w:numPr>
       </w:pPr>
       <w:r>
-        <w:t xml:space="preserve">* </w:t>
-      </w:r>
-      <w:r>
-        <w:rPr>
-          <w:b/>
+        <w:rPr>
+          <w:b/>
+        </w:rPr>
+        <w:t xml:space="preserve">* Source ID: </w:t>
+      </w:r>
+      <w:r>
+        <w:rPr>
           <w:bCs/>
         </w:rPr>
-        <w:t>Download Name</w:t>
-      </w:r>
-      <w:r>
-        <w:t xml:space="preserve">: </w:t>
-      </w:r>
-      <w:r>
-        <w:t>[</w:t>
-      </w:r>
-      <w:r>
-        <w:t>b2f20721-05f6-4358-8783-b5f03790974b</w:t>
-      </w:r>
-      <w:r>
-        <w:t>.pdf</w:t>
-      </w:r>
-      <w:r>
-        <w:t xml:space="preserve"> -&gt; </w:t>
-      </w:r>
-      <w:r>
-        <w:t>Discover - Arabic - Kg 1 - First Semester</w:t>
-      </w:r>
-      <w:r>
-        <w:t>.pdf</w:t>
-      </w:r>
-      <w:r>
-        <w:t>] [</w:t>
-      </w:r>
-      <w:r>
-        <w:t>Discover - Arabic - Kg 1 - First Semester</w:t>
-      </w:r>
-      <w:r>
-        <w:t>]</w:t>
-      </w:r>
-      <w:r>
-        <w:br/>
-      </w:r>
-      <w:r>
-        <w:t xml:space="preserve">* </w:t>
-      </w:r>
-      <w:r>
-        <w:rPr>
-          <w:b/>
+        <w:t>1</w:t>
+      </w:r>
+      <w:r>
+        <w:rPr>
           <w:bCs/>
         </w:rPr>
-        <w:t>Download Type</w:t>
+        <w:t>06</w:t>
+      </w:r>
+    </w:p>
+    <w:p>
+      <w:pPr>
+        <w:pStyle w:val="ListParagraph"/>
+      </w:pPr>
+      <w:r>
+        <w:t xml:space="preserve">* </w:t>
+      </w:r>
+      <w:r>
+        <w:rPr>
+          <w:b/>
+        </w:rPr>
+        <w:t>Content Title</w:t>
+      </w:r>
+      <w:r>
+        <w:t>: [b2f20721-05f6-4358-8783-b5f03790974b.pdf -&gt; Discover - Arabic - Kg 1 - First Semester.pdf] [Discover - Arabic - Kg 1 - First Semester]</w:t>
+      </w:r>
+    </w:p>
+    <w:p>
+      <w:pPr>
+        <w:pStyle w:val="ListParagraph"/>
+      </w:pPr>
+      <w:r>
+        <w:t xml:space="preserve">* </w:t>
+      </w:r>
+      <w:r>
+        <w:rPr>
+          <w:b/>
+        </w:rPr>
+        <w:t>Content Type</w:t>
       </w:r>
       <w:r>
         <w:t>: Document</w:t>
@@ -77,74 +73,47 @@
       <w:r>
         <w:rPr>
           <w:b/>
-          <w:bCs/>
-        </w:rPr>
-        <w:t>Source Type</w:t>
+        </w:rPr>
+        <w:t>Domain</w:t>
       </w:r>
       <w:r>
         <w:t>: Educational</w:t>
       </w:r>
-      <w:r>
-        <w:rPr>
-          <w:rtl/>
-        </w:rPr>
-        <w:br/>
-      </w:r>
-      <w:r>
-        <w:t xml:space="preserve">* </w:t>
-      </w:r>
-      <w:r>
-        <w:rPr>
-          <w:b/>
-          <w:bCs/>
+    </w:p>
+    <w:p>
+      <w:pPr>
+        <w:ind w:left="720"/>
+      </w:pPr>
+      <w:r>
+        <w:t xml:space="preserve">* </w:t>
+      </w:r>
+      <w:r>
+        <w:rPr>
+          <w:b/>
         </w:rPr>
         <w:t>Source Platform</w:t>
       </w:r>
       <w:r>
-        <w:t xml:space="preserve">: </w:t>
-      </w:r>
-      <w:r>
-        <w:t>Egyptian Ministry of Education – E-Learning Portal (https://moe.gov.eg)</w:t>
-      </w:r>
-    </w:p>
-    <w:p>
-      <w:pPr>
-        <w:ind w:left="720"/>
-      </w:pPr>
-      <w:r>
-        <w:t xml:space="preserve">* </w:t>
-      </w:r>
-      <w:r>
-        <w:rPr>
-          <w:b/>
-          <w:bCs/>
-        </w:rPr>
-        <w:t>Download Source</w:t>
-      </w:r>
-      <w:r>
-        <w:t>:</w:t>
-      </w:r>
-      <w:r>
-        <w:t xml:space="preserve"> </w:t>
+        <w:t>: Egyptian Ministry of Education – E-Learning Portal (https://moe.gov.eg)</w:t>
+      </w:r>
+    </w:p>
+    <w:p>
+      <w:pPr>
+        <w:ind w:left="720"/>
+      </w:pPr>
+      <w:r>
+        <w:t xml:space="preserve">* </w:t>
+      </w:r>
+      <w:r>
+        <w:rPr>
+          <w:b/>
+        </w:rPr>
+        <w:t>Source Reference</w:t>
+      </w:r>
+      <w:r>
+        <w:t xml:space="preserve">: https://moe.gov.eg/ar/elearningenterypage/e-learning/?schoolStageId=6959&amp;schoolYearId=6960&amp;schoolTermId=1584&amp;contentTypeId=7597&amp;pageIndex=0&amp;sortBy=0 -&gt; </w:t>
       </w:r>
       <w:hyperlink r:id="rId5" w:history="1">
-        <w:r>
-          <w:rPr>
-            <w:rStyle w:val="Hyperlink"/>
-          </w:rPr>
-          <w:t>https://moe.gov.eg/ar/elearningenterypage/e-learning/?schoolStageId=6959&amp;schoolYearId=6960&amp;schoolTermId=1584&amp;contentTypeId=7597&amp;pageIndex=0&amp;sortBy=0</w:t>
-        </w:r>
-      </w:hyperlink>
-      <w:r>
-        <w:t xml:space="preserve"> </w:t>
-      </w:r>
-      <w:r>
-        <w:t>-&gt;</w:t>
-      </w:r>
-      <w:r>
-        <w:t xml:space="preserve"> </w:t>
-      </w:r>
-      <w:hyperlink r:id="rId6" w:history="1">
         <w:r>
           <w:rPr>
             <w:rStyle w:val="Hyperlink"/>
@@ -152,6 +121,51 @@
           <w:t>https://elearnningcontent.blob.core.windows.net/elearnningcontent/2026/KG/KG1/Term1/StudentBook/Discovery_AR_KG1_TR1.pdf</w:t>
         </w:r>
       </w:hyperlink>
+    </w:p>
+    <w:p>
+      <w:pPr>
+        <w:ind w:left="720"/>
+      </w:pPr>
+      <w:r>
+        <w:t xml:space="preserve">* </w:t>
+      </w:r>
+      <w:r>
+        <w:rPr>
+          <w:b/>
+          <w:bCs/>
+        </w:rPr>
+        <w:t>Source Type</w:t>
+      </w:r>
+      <w:r>
+        <w:t xml:space="preserve">: </w:t>
+      </w:r>
+      <w:r>
+        <w:t>Downloaded</w:t>
+      </w:r>
+    </w:p>
+    <w:p>
+      <w:pPr>
+        <w:ind w:left="720"/>
+      </w:pPr>
+      <w:r>
+        <w:t xml:space="preserve">* </w:t>
+      </w:r>
+      <w:r>
+        <w:rPr>
+          <w:b/>
+          <w:bCs/>
+        </w:rPr>
+        <w:t>Source Nature:</w:t>
+      </w:r>
+      <w:r>
+        <w:t xml:space="preserve"> </w:t>
+      </w:r>
+      <w:r>
+        <w:t>D</w:t>
+      </w:r>
+      <w:r>
+        <w:t>igital</w:t>
+      </w:r>
       <w:r>
         <w:t xml:space="preserve"> </w:t>
       </w:r>
@@ -170,58 +184,42 @@
       <w:r>
         <w:rPr>
           <w:b/>
-          <w:bCs/>
-        </w:rPr>
-        <w:t xml:space="preserve">Download </w:t>
-      </w:r>
-      <w:r>
-        <w:rPr>
-          <w:b/>
-          <w:bCs/>
-        </w:rPr>
-        <w:t>Server / Mirror</w:t>
-      </w:r>
-      <w:r>
-        <w:t xml:space="preserve">: </w:t>
-      </w:r>
-      <w:r>
-        <w:t>https://elearnningcontent.blob.core.windows.net [Microsoft Azure Blob Storage Server]</w:t>
-      </w:r>
-    </w:p>
-    <w:p>
-      <w:pPr>
-        <w:ind w:left="720"/>
-      </w:pPr>
-      <w:r>
-        <w:t xml:space="preserve">* </w:t>
-      </w:r>
-      <w:r>
-        <w:rPr>
-          <w:b/>
-          <w:bCs/>
-        </w:rPr>
-        <w:t>Download Method</w:t>
-      </w:r>
-      <w:r>
-        <w:t xml:space="preserve">: </w:t>
-      </w:r>
-      <w:r>
-        <w:t>Web Browser: Direct Save [Saved pdf directly from browser]</w:t>
-      </w:r>
-    </w:p>
-    <w:p>
-      <w:pPr>
-        <w:ind w:left="720"/>
-      </w:pPr>
-      <w:r>
-        <w:t xml:space="preserve">* </w:t>
-      </w:r>
-      <w:r>
-        <w:rPr>
-          <w:b/>
-          <w:bCs/>
-        </w:rPr>
-        <w:t>Download Format</w:t>
+        </w:rPr>
+        <w:t>Storage Host</w:t>
+      </w:r>
+      <w:r>
+        <w:t>: https://elearnningcontent.blob.core.windows.net [Microsoft Azure Blob Storage Server]</w:t>
+      </w:r>
+    </w:p>
+    <w:p>
+      <w:pPr>
+        <w:ind w:left="720"/>
+      </w:pPr>
+      <w:r>
+        <w:t xml:space="preserve">* </w:t>
+      </w:r>
+      <w:r>
+        <w:rPr>
+          <w:b/>
+        </w:rPr>
+        <w:t>Acquisition Method</w:t>
+      </w:r>
+      <w:r>
+        <w:t>: Web Browser: Direct Save [Saved pdf directly from browser]</w:t>
+      </w:r>
+    </w:p>
+    <w:p>
+      <w:pPr>
+        <w:ind w:left="720"/>
+      </w:pPr>
+      <w:r>
+        <w:t xml:space="preserve">* </w:t>
+      </w:r>
+      <w:r>
+        <w:rPr>
+          <w:b/>
+        </w:rPr>
+        <w:t>File Format</w:t>
       </w:r>
       <w:r>
         <w:t>: .pdf</w:t>
@@ -237,9 +235,8 @@
       <w:r>
         <w:rPr>
           <w:b/>
-          <w:bCs/>
-        </w:rPr>
-        <w:t>Download Quality</w:t>
+        </w:rPr>
+        <w:t>Content Quality</w:t>
       </w:r>
       <w:r>
         <w:t>: High</w:t>
@@ -255,9 +252,8 @@
       <w:r>
         <w:rPr>
           <w:b/>
-          <w:bCs/>
-        </w:rPr>
-        <w:t>Download Date</w:t>
+        </w:rPr>
+        <w:t>Acquisition Date</w:t>
       </w:r>
       <w:r>
         <w:t>: 8/13/2025</w:t>
@@ -274,13 +270,10 @@
         <w:rPr>
           <w:b/>
         </w:rPr>
-        <w:t>Saved Location</w:t>
-      </w:r>
-      <w:r>
-        <w:t xml:space="preserve">: </w:t>
-      </w:r>
-      <w:r>
-        <w:t>StorageType: Cloud -&gt; Platform: GitHub -&gt; Account: topicsscience -&gt; Repository: kingdomheartsknowledge -&gt; Path: Knowledge/1-Academic/1-school/..</w:t>
+        <w:t>Storage Location</w:t>
+      </w:r>
+      <w:r>
+        <w:t>: StorageType: Cloud -&gt; Platform: GitHub -&gt; Account: topicsscience -&gt; Repository: kingdomheartsknowledge -&gt; Path: Knowledge/1-Academic/1-school/..</w:t>
       </w:r>
     </w:p>
     <w:p>
@@ -293,31 +286,19 @@
       <w:r>
         <w:rPr>
           <w:b/>
-          <w:bCs/>
         </w:rPr>
         <w:t>Notes</w:t>
       </w:r>
       <w:r>
-        <w:t>: Egyptian educational curriculum</w:t>
-      </w:r>
-      <w:r>
-        <w:t>:</w:t>
-      </w:r>
-      <w:r>
-        <w:t xml:space="preserve"> 2025</w:t>
-      </w:r>
-      <w:r>
-        <w:t xml:space="preserve"> - </w:t>
-      </w:r>
-      <w:r>
-        <w:t>2026</w:t>
-      </w:r>
-    </w:p>
-    <w:p>
-      <w:r>
-        <w:br w:type="page"/>
-      </w:r>
-    </w:p>
+        <w:t>: Egyptian educational curriculum: 2025 - 2026</w:t>
+      </w:r>
+    </w:p>
+    <w:p/>
+    <w:p/>
+    <w:p/>
+    <w:p/>
+    <w:p/>
+    <w:p/>
     <w:p>
       <w:pPr>
         <w:pStyle w:val="ListParagraph"/>
@@ -327,61 +308,56 @@
         </w:numPr>
       </w:pPr>
       <w:r>
+        <w:rPr>
+          <w:b/>
+        </w:rPr>
         <w:lastRenderedPageBreak/>
-        <w:t xml:space="preserve">* </w:t>
-      </w:r>
-      <w:r>
-        <w:rPr>
-          <w:b/>
+        <w:t xml:space="preserve">* Source ID: </w:t>
+      </w:r>
+      <w:r>
+        <w:rPr>
           <w:bCs/>
         </w:rPr>
-        <w:t>Download Name</w:t>
-      </w:r>
-      <w:r>
-        <w:t xml:space="preserve">: </w:t>
-      </w:r>
-      <w:r>
-        <w:t>[</w:t>
-      </w:r>
-      <w:r>
-        <w:t>0d6c8868-e136-4f58-b070-d27a98ce6a99</w:t>
-      </w:r>
-      <w:r>
-        <w:t>.pdf</w:t>
-      </w:r>
-      <w:r>
-        <w:t xml:space="preserve"> -&gt; </w:t>
-      </w:r>
-      <w:r>
-        <w:t>Discover - English - Kg 1 - First Semester</w:t>
-      </w:r>
-      <w:r>
-        <w:t>.pdf</w:t>
-      </w:r>
-      <w:r>
-        <w:t>]</w:t>
-      </w:r>
-      <w:r>
-        <w:t xml:space="preserve"> [</w:t>
-      </w:r>
-      <w:r>
-        <w:t>Discover - English - Kg 1 - First Semester</w:t>
-      </w:r>
-      <w:r>
-        <w:t>]</w:t>
+        <w:t>1</w:t>
+      </w:r>
+      <w:r>
+        <w:rPr>
+          <w:bCs/>
+        </w:rPr>
+        <w:t>0</w:t>
+      </w:r>
+      <w:r>
+        <w:rPr>
+          <w:bCs/>
+        </w:rPr>
+        <w:t>7</w:t>
+      </w:r>
+    </w:p>
+    <w:p>
+      <w:pPr>
+        <w:pStyle w:val="ListParagraph"/>
+      </w:pPr>
+      <w:r>
+        <w:t xml:space="preserve">* </w:t>
+      </w:r>
+      <w:r>
+        <w:rPr>
+          <w:b/>
+        </w:rPr>
+        <w:t>Content Title</w:t>
+      </w:r>
+      <w:r>
+        <w:t>: [0d6c8868-e136-4f58-b070-d27a98ce6a99.pdf -&gt; Discover - English - Kg 1 - First Semester.pdf] [Discover - English - Kg 1 - First Semester]</w:t>
       </w:r>
       <w:r>
         <w:br/>
-      </w:r>
-      <w:r>
-        <w:t xml:space="preserve">* </w:t>
-      </w:r>
-      <w:r>
-        <w:rPr>
-          <w:b/>
-          <w:bCs/>
-        </w:rPr>
-        <w:t>Download Type</w:t>
+        <w:t xml:space="preserve">* </w:t>
+      </w:r>
+      <w:r>
+        <w:rPr>
+          <w:b/>
+        </w:rPr>
+        <w:t>Content Type</w:t>
       </w:r>
       <w:r>
         <w:t>: Document</w:t>
@@ -397,65 +373,43 @@
       <w:r>
         <w:rPr>
           <w:b/>
-          <w:bCs/>
-        </w:rPr>
-        <w:t>Source Type</w:t>
+        </w:rPr>
+        <w:t>Domain</w:t>
       </w:r>
       <w:r>
         <w:t>: Educational</w:t>
       </w:r>
       <w:r>
-        <w:rPr>
-          <w:rtl/>
-        </w:rPr>
         <w:br/>
-      </w:r>
-      <w:r>
-        <w:t xml:space="preserve">* </w:t>
-      </w:r>
-      <w:r>
-        <w:rPr>
-          <w:b/>
-          <w:bCs/>
+        <w:t xml:space="preserve">* </w:t>
+      </w:r>
+      <w:r>
+        <w:rPr>
+          <w:b/>
         </w:rPr>
         <w:t>Source Platform</w:t>
       </w:r>
       <w:r>
-        <w:t xml:space="preserve">: </w:t>
-      </w:r>
-      <w:r>
-        <w:t>Egyptian Ministry of Education – E-Learning Portal (https://moe.gov.eg)</w:t>
-      </w:r>
-    </w:p>
-    <w:p>
-      <w:pPr>
-        <w:ind w:left="720"/>
-      </w:pPr>
-      <w:r>
-        <w:t xml:space="preserve">* </w:t>
-      </w:r>
-      <w:r>
-        <w:rPr>
-          <w:b/>
-          <w:bCs/>
-        </w:rPr>
-        <w:t>Download Source</w:t>
-      </w:r>
-      <w:r>
-        <w:t xml:space="preserve">: </w:t>
-      </w:r>
-      <w:hyperlink r:id="rId7" w:history="1">
-        <w:r>
-          <w:rPr>
-            <w:rStyle w:val="Hyperlink"/>
-          </w:rPr>
-          <w:t>https://moe.gov.eg/ar/elearningenterypage/e-learning/?schoolStageId=6959&amp;schoolYearId=6960&amp;schoolTermId=1584&amp;contentTypeId=7597&amp;pageIndex=0&amp;sortBy=0</w:t>
-        </w:r>
-      </w:hyperlink>
-      <w:r>
-        <w:t xml:space="preserve"> -&gt; </w:t>
-      </w:r>
-      <w:hyperlink r:id="rId8" w:history="1">
+        <w:t>: Egyptian Ministry of Education – E-Learning Portal (https://moe.gov.eg)</w:t>
+      </w:r>
+    </w:p>
+    <w:p>
+      <w:pPr>
+        <w:ind w:left="720"/>
+      </w:pPr>
+      <w:r>
+        <w:t xml:space="preserve">* </w:t>
+      </w:r>
+      <w:r>
+        <w:rPr>
+          <w:b/>
+        </w:rPr>
+        <w:t>Source Reference</w:t>
+      </w:r>
+      <w:r>
+        <w:t xml:space="preserve">: https://moe.gov.eg/ar/elearningenterypage/e-learning/?schoolStageId=6959&amp;schoolYearId=6960&amp;schoolTermId=1584&amp;contentTypeId=7597&amp;pageIndex=0&amp;sortBy=0 -&gt; </w:t>
+      </w:r>
+      <w:hyperlink r:id="rId6" w:history="1">
         <w:r>
           <w:rPr>
             <w:rStyle w:val="Hyperlink"/>
@@ -463,6 +417,54 @@
           <w:t>https://elearnningcontent.blob.core.windows.net/elearnningcontent/2026/KG/KG1/Term1/StudentBook/Discovery_E_KG1_TR1.pdf</w:t>
         </w:r>
       </w:hyperlink>
+    </w:p>
+    <w:p>
+      <w:pPr>
+        <w:ind w:left="720"/>
+      </w:pPr>
+      <w:r>
+        <w:t xml:space="preserve">* </w:t>
+      </w:r>
+      <w:r>
+        <w:rPr>
+          <w:b/>
+          <w:bCs/>
+        </w:rPr>
+        <w:t>Source Type</w:t>
+      </w:r>
+      <w:r>
+        <w:t xml:space="preserve">: </w:t>
+      </w:r>
+      <w:r>
+        <w:t>Downloaded</w:t>
+      </w:r>
+    </w:p>
+    <w:p>
+      <w:pPr>
+        <w:ind w:left="720"/>
+      </w:pPr>
+      <w:r>
+        <w:t xml:space="preserve">* </w:t>
+      </w:r>
+      <w:r>
+        <w:rPr>
+          <w:b/>
+          <w:bCs/>
+        </w:rPr>
+        <w:t>Source Nature:</w:t>
+      </w:r>
+      <w:r>
+        <w:t xml:space="preserve"> </w:t>
+      </w:r>
+      <w:r>
+        <w:t>D</w:t>
+      </w:r>
+      <w:r>
+        <w:t>igital</w:t>
+      </w:r>
+      <w:r>
+        <w:t xml:space="preserve"> </w:t>
+      </w:r>
       <w:r>
         <w:t xml:space="preserve"> </w:t>
       </w:r>
@@ -481,58 +483,42 @@
       <w:r>
         <w:rPr>
           <w:b/>
-          <w:bCs/>
-        </w:rPr>
-        <w:t xml:space="preserve">Download </w:t>
-      </w:r>
-      <w:r>
-        <w:rPr>
-          <w:b/>
-          <w:bCs/>
-        </w:rPr>
-        <w:t>Server / Mirror</w:t>
-      </w:r>
-      <w:r>
-        <w:t xml:space="preserve">: </w:t>
-      </w:r>
-      <w:r>
-        <w:t>https://elearnningcontent.blob.core.windows.net [Microsoft Azure Blob Storage Server]</w:t>
-      </w:r>
-    </w:p>
-    <w:p>
-      <w:pPr>
-        <w:ind w:left="720"/>
-      </w:pPr>
-      <w:r>
-        <w:t xml:space="preserve">* </w:t>
-      </w:r>
-      <w:r>
-        <w:rPr>
-          <w:b/>
-          <w:bCs/>
-        </w:rPr>
-        <w:t>Download Method</w:t>
-      </w:r>
-      <w:r>
-        <w:t xml:space="preserve">: </w:t>
-      </w:r>
-      <w:r>
-        <w:t>Web Browser: Direct Save [Saved pdf directly from browser]</w:t>
-      </w:r>
-    </w:p>
-    <w:p>
-      <w:pPr>
-        <w:ind w:left="720"/>
-      </w:pPr>
-      <w:r>
-        <w:t xml:space="preserve">* </w:t>
-      </w:r>
-      <w:r>
-        <w:rPr>
-          <w:b/>
-          <w:bCs/>
-        </w:rPr>
-        <w:t>Download Format</w:t>
+        </w:rPr>
+        <w:t>Storage Host</w:t>
+      </w:r>
+      <w:r>
+        <w:t>: https://elearnningcontent.blob.core.windows.net [Microsoft Azure Blob Storage Server]</w:t>
+      </w:r>
+    </w:p>
+    <w:p>
+      <w:pPr>
+        <w:ind w:left="720"/>
+      </w:pPr>
+      <w:r>
+        <w:t xml:space="preserve">* </w:t>
+      </w:r>
+      <w:r>
+        <w:rPr>
+          <w:b/>
+        </w:rPr>
+        <w:t>Acquisition Method</w:t>
+      </w:r>
+      <w:r>
+        <w:t>: Web Browser: Direct Save [Saved pdf directly from browser]</w:t>
+      </w:r>
+    </w:p>
+    <w:p>
+      <w:pPr>
+        <w:ind w:left="720"/>
+      </w:pPr>
+      <w:r>
+        <w:t xml:space="preserve">* </w:t>
+      </w:r>
+      <w:r>
+        <w:rPr>
+          <w:b/>
+        </w:rPr>
+        <w:t>File Format</w:t>
       </w:r>
       <w:r>
         <w:t>: .pdf</w:t>
@@ -548,9 +534,8 @@
       <w:r>
         <w:rPr>
           <w:b/>
-          <w:bCs/>
-        </w:rPr>
-        <w:t>Download Quality</w:t>
+        </w:rPr>
+        <w:t>Content Quality</w:t>
       </w:r>
       <w:r>
         <w:t>: High</w:t>
@@ -566,9 +551,8 @@
       <w:r>
         <w:rPr>
           <w:b/>
-          <w:bCs/>
-        </w:rPr>
-        <w:t>Download Date</w:t>
+        </w:rPr>
+        <w:t>Acquisition Date</w:t>
       </w:r>
       <w:r>
         <w:t>: 8/13/2025</w:t>
@@ -585,13 +569,10 @@
         <w:rPr>
           <w:b/>
         </w:rPr>
-        <w:t>Saved Location</w:t>
-      </w:r>
-      <w:r>
-        <w:t xml:space="preserve">: </w:t>
-      </w:r>
-      <w:r>
-        <w:t>StorageType: Cloud -&gt; Platform: GitHub -&gt; Account: topicsscience -&gt; Repository: kingdomheartsknowledge -&gt; Path: Knowledge/1-Academic/1-school/..</w:t>
+        <w:t>Storage Location</w:t>
+      </w:r>
+      <w:r>
+        <w:t>: StorageType: Cloud -&gt; Platform: GitHub -&gt; Account: topicsscience -&gt; Repository: kingdomheartsknowledge -&gt; Path: Knowledge/1-Academic/1-school/..</w:t>
       </w:r>
     </w:p>
     <w:p>
@@ -604,24 +585,11 @@
       <w:r>
         <w:rPr>
           <w:b/>
-          <w:bCs/>
         </w:rPr>
         <w:t>Notes</w:t>
       </w:r>
       <w:r>
-        <w:t>: Egyptian educational curriculum</w:t>
-      </w:r>
-      <w:r>
-        <w:t>:</w:t>
-      </w:r>
-      <w:r>
-        <w:t xml:space="preserve"> 2025</w:t>
-      </w:r>
-      <w:r>
-        <w:t xml:space="preserve"> - </w:t>
-      </w:r>
-      <w:r>
-        <w:t>2026</w:t>
+        <w:t>: Egyptian educational curriculum: 2025 - 2026</w:t>
       </w:r>
     </w:p>
     <w:p>
@@ -629,11 +597,11 @@
         <w:ind w:firstLine="720"/>
       </w:pPr>
     </w:p>
-    <w:p>
-      <w:r>
-        <w:br w:type="page"/>
-      </w:r>
-    </w:p>
+    <w:p/>
+    <w:p/>
+    <w:p/>
+    <w:p/>
+    <w:p/>
     <w:p>
       <w:pPr>
         <w:pStyle w:val="ListParagraph"/>
@@ -643,56 +611,54 @@
         </w:numPr>
       </w:pPr>
       <w:r>
+        <w:rPr>
+          <w:b/>
+        </w:rPr>
         <w:lastRenderedPageBreak/>
-        <w:t xml:space="preserve">* </w:t>
-      </w:r>
-      <w:r>
-        <w:rPr>
-          <w:b/>
+        <w:t xml:space="preserve">* Source ID: </w:t>
+      </w:r>
+      <w:r>
+        <w:rPr>
           <w:bCs/>
         </w:rPr>
-        <w:t>Download Name</w:t>
-      </w:r>
-      <w:r>
-        <w:t xml:space="preserve">: </w:t>
-      </w:r>
-      <w:r>
-        <w:t>[</w:t>
-      </w:r>
-      <w:r>
-        <w:t>d5e5f430-fbb8-4d58-86c8-a917fa7fe8a3</w:t>
-      </w:r>
-      <w:r>
-        <w:t>.pdf</w:t>
-      </w:r>
-      <w:r>
-        <w:t xml:space="preserve"> -&gt; Discover - French - Kg 1 - First Semester</w:t>
-      </w:r>
-      <w:r>
-        <w:t>.pdf</w:t>
-      </w:r>
-      <w:r>
-        <w:t>]</w:t>
-      </w:r>
-      <w:r>
-        <w:t xml:space="preserve"> [</w:t>
-      </w:r>
-      <w:r>
-        <w:t>Discover - French - Kg 1 - First Semester</w:t>
-      </w:r>
-      <w:r>
-        <w:t>]</w:t>
+        <w:t>1</w:t>
+      </w:r>
+      <w:r>
+        <w:rPr>
+          <w:bCs/>
+        </w:rPr>
+        <w:t>0</w:t>
+      </w:r>
+      <w:r>
+        <w:rPr>
+          <w:bCs/>
+        </w:rPr>
+        <w:t>8</w:t>
       </w:r>
       <w:r>
         <w:br/>
-        <w:t xml:space="preserve">* </w:t>
-      </w:r>
-      <w:r>
-        <w:rPr>
-          <w:b/>
-          <w:bCs/>
-        </w:rPr>
-        <w:t>Download Type</w:t>
+      </w:r>
+      <w:r>
+        <w:t xml:space="preserve">* </w:t>
+      </w:r>
+      <w:r>
+        <w:rPr>
+          <w:b/>
+        </w:rPr>
+        <w:t>Content Title</w:t>
+      </w:r>
+      <w:r>
+        <w:t>: [d5e5f430-fbb8-4d58-86c8-a917fa7fe8a3.pdf -&gt; Discover - French - Kg 1 - First Semester.pdf] [Discover - French - Kg 1 - First Semester]</w:t>
+      </w:r>
+      <w:r>
+        <w:br/>
+        <w:t xml:space="preserve">* </w:t>
+      </w:r>
+      <w:r>
+        <w:rPr>
+          <w:b/>
+        </w:rPr>
+        <w:t>Content Type</w:t>
       </w:r>
       <w:r>
         <w:t>: Document</w:t>
@@ -708,68 +674,43 @@
       <w:r>
         <w:rPr>
           <w:b/>
-          <w:bCs/>
-        </w:rPr>
-        <w:t>Source Type</w:t>
+        </w:rPr>
+        <w:t>Domain</w:t>
       </w:r>
       <w:r>
         <w:t>: Educational</w:t>
       </w:r>
       <w:r>
-        <w:rPr>
-          <w:rtl/>
-        </w:rPr>
         <w:br/>
-      </w:r>
-      <w:r>
-        <w:t xml:space="preserve">* </w:t>
-      </w:r>
-      <w:r>
-        <w:rPr>
-          <w:b/>
-          <w:bCs/>
+        <w:t xml:space="preserve">* </w:t>
+      </w:r>
+      <w:r>
+        <w:rPr>
+          <w:b/>
         </w:rPr>
         <w:t>Source Platform</w:t>
       </w:r>
       <w:r>
-        <w:t xml:space="preserve">: </w:t>
-      </w:r>
-      <w:r>
-        <w:t>Egyptian Ministry of Education – E-Learning Portal (https://moe.gov.eg)</w:t>
-      </w:r>
-    </w:p>
-    <w:p>
-      <w:pPr>
-        <w:ind w:left="720"/>
-      </w:pPr>
-      <w:r>
-        <w:t xml:space="preserve">* </w:t>
-      </w:r>
-      <w:r>
-        <w:rPr>
-          <w:b/>
-          <w:bCs/>
-        </w:rPr>
-        <w:t>Download Source</w:t>
-      </w:r>
-      <w:r>
-        <w:t xml:space="preserve">: </w:t>
-      </w:r>
-      <w:hyperlink r:id="rId9" w:history="1">
-        <w:r>
-          <w:rPr>
-            <w:rStyle w:val="Hyperlink"/>
-          </w:rPr>
-          <w:t>https://moe.gov.eg/ar/elearningenterypage/e-learning/?schoolStageId=6959&amp;schoolYearId=6960&amp;schoolTermId=1584&amp;contentTypeId=7597&amp;pageIndex=0&amp;sortBy=0</w:t>
-        </w:r>
-      </w:hyperlink>
-      <w:r>
-        <w:t xml:space="preserve"> </w:t>
-      </w:r>
-      <w:r>
-        <w:t xml:space="preserve">-&gt; </w:t>
-      </w:r>
-      <w:hyperlink r:id="rId10" w:history="1">
+        <w:t>: Egyptian Ministry of Education – E-Learning Portal (https://moe.gov.eg)</w:t>
+      </w:r>
+    </w:p>
+    <w:p>
+      <w:pPr>
+        <w:ind w:left="720"/>
+      </w:pPr>
+      <w:r>
+        <w:t xml:space="preserve">* </w:t>
+      </w:r>
+      <w:r>
+        <w:rPr>
+          <w:b/>
+        </w:rPr>
+        <w:t>Source Reference</w:t>
+      </w:r>
+      <w:r>
+        <w:t xml:space="preserve">: https://moe.gov.eg/ar/elearningenterypage/e-learning/?schoolStageId=6959&amp;schoolYearId=6960&amp;schoolTermId=1584&amp;contentTypeId=7597&amp;pageIndex=0&amp;sortBy=0 -&gt; </w:t>
+      </w:r>
+      <w:hyperlink r:id="rId7" w:history="1">
         <w:r>
           <w:rPr>
             <w:rStyle w:val="Hyperlink"/>
@@ -777,6 +718,51 @@
           <w:t>https://elearnningcontent.blob.core.windows.net/elearnningcontent/2026/KG/KG1/Term1/StudentBook/Discovery_F_KG1_TR1.pdf</w:t>
         </w:r>
       </w:hyperlink>
+    </w:p>
+    <w:p>
+      <w:pPr>
+        <w:ind w:left="720"/>
+      </w:pPr>
+      <w:r>
+        <w:t xml:space="preserve">* </w:t>
+      </w:r>
+      <w:r>
+        <w:rPr>
+          <w:b/>
+          <w:bCs/>
+        </w:rPr>
+        <w:t>Source Type</w:t>
+      </w:r>
+      <w:r>
+        <w:t xml:space="preserve">: </w:t>
+      </w:r>
+      <w:r>
+        <w:t>Downloaded</w:t>
+      </w:r>
+    </w:p>
+    <w:p>
+      <w:pPr>
+        <w:ind w:left="720"/>
+      </w:pPr>
+      <w:r>
+        <w:t xml:space="preserve">* </w:t>
+      </w:r>
+      <w:r>
+        <w:rPr>
+          <w:b/>
+          <w:bCs/>
+        </w:rPr>
+        <w:t>Source Nature:</w:t>
+      </w:r>
+      <w:r>
+        <w:t xml:space="preserve"> </w:t>
+      </w:r>
+      <w:r>
+        <w:t>D</w:t>
+      </w:r>
+      <w:r>
+        <w:t>igital</w:t>
+      </w:r>
       <w:r>
         <w:t xml:space="preserve"> </w:t>
       </w:r>
@@ -795,58 +781,42 @@
       <w:r>
         <w:rPr>
           <w:b/>
-          <w:bCs/>
-        </w:rPr>
-        <w:t xml:space="preserve">Download </w:t>
-      </w:r>
-      <w:r>
-        <w:rPr>
-          <w:b/>
-          <w:bCs/>
-        </w:rPr>
-        <w:t>Server / Mirror</w:t>
-      </w:r>
-      <w:r>
-        <w:t xml:space="preserve">: </w:t>
-      </w:r>
-      <w:r>
-        <w:t>https://elearnningcontent.blob.core.windows.net [Microsoft Azure Blob Storage Server]</w:t>
-      </w:r>
-    </w:p>
-    <w:p>
-      <w:pPr>
-        <w:ind w:left="720"/>
-      </w:pPr>
-      <w:r>
-        <w:t xml:space="preserve">* </w:t>
-      </w:r>
-      <w:r>
-        <w:rPr>
-          <w:b/>
-          <w:bCs/>
-        </w:rPr>
-        <w:t>Download Method</w:t>
-      </w:r>
-      <w:r>
-        <w:t xml:space="preserve">: </w:t>
-      </w:r>
-      <w:r>
-        <w:t>Web Browser: Direct Save [Saved pdf directly from browser]</w:t>
-      </w:r>
-    </w:p>
-    <w:p>
-      <w:pPr>
-        <w:ind w:left="720"/>
-      </w:pPr>
-      <w:r>
-        <w:t xml:space="preserve">* </w:t>
-      </w:r>
-      <w:r>
-        <w:rPr>
-          <w:b/>
-          <w:bCs/>
-        </w:rPr>
-        <w:t>Download Format</w:t>
+        </w:rPr>
+        <w:t>Storage Host</w:t>
+      </w:r>
+      <w:r>
+        <w:t>: https://elearnningcontent.blob.core.windows.net [Microsoft Azure Blob Storage Server]</w:t>
+      </w:r>
+    </w:p>
+    <w:p>
+      <w:pPr>
+        <w:ind w:left="720"/>
+      </w:pPr>
+      <w:r>
+        <w:t xml:space="preserve">* </w:t>
+      </w:r>
+      <w:r>
+        <w:rPr>
+          <w:b/>
+        </w:rPr>
+        <w:t>Acquisition Method</w:t>
+      </w:r>
+      <w:r>
+        <w:t>: Web Browser: Direct Save [Saved pdf directly from browser]</w:t>
+      </w:r>
+    </w:p>
+    <w:p>
+      <w:pPr>
+        <w:ind w:left="720"/>
+      </w:pPr>
+      <w:r>
+        <w:t xml:space="preserve">* </w:t>
+      </w:r>
+      <w:r>
+        <w:rPr>
+          <w:b/>
+        </w:rPr>
+        <w:t>File Format</w:t>
       </w:r>
       <w:r>
         <w:t>: .pdf</w:t>
@@ -862,9 +832,8 @@
       <w:r>
         <w:rPr>
           <w:b/>
-          <w:bCs/>
-        </w:rPr>
-        <w:t>Download Quality</w:t>
+        </w:rPr>
+        <w:t>Content Quality</w:t>
       </w:r>
       <w:r>
         <w:t>: High</w:t>
@@ -880,9 +849,8 @@
       <w:r>
         <w:rPr>
           <w:b/>
-          <w:bCs/>
-        </w:rPr>
-        <w:t>Download Date</w:t>
+        </w:rPr>
+        <w:t>Acquisition Date</w:t>
       </w:r>
       <w:r>
         <w:t>: 8/13/2025</w:t>
@@ -899,13 +867,10 @@
         <w:rPr>
           <w:b/>
         </w:rPr>
-        <w:t>Saved Location</w:t>
-      </w:r>
-      <w:r>
-        <w:t xml:space="preserve">: </w:t>
-      </w:r>
-      <w:r>
-        <w:t>StorageType: Cloud -&gt; Platform: GitHub -&gt; Account: topicsscience -&gt; Repository: kingdomheartsknowledge -&gt; Path: Knowledge/1-Academic/1-school/..</w:t>
+        <w:t>Storage Location</w:t>
+      </w:r>
+      <w:r>
+        <w:t>: StorageType: Cloud -&gt; Platform: GitHub -&gt; Account: topicsscience -&gt; Repository: kingdomheartsknowledge -&gt; Path: Knowledge/1-Academic/1-school/..</w:t>
       </w:r>
     </w:p>
     <w:p>
@@ -918,24 +883,11 @@
       <w:r>
         <w:rPr>
           <w:b/>
-          <w:bCs/>
         </w:rPr>
         <w:t>Notes</w:t>
       </w:r>
       <w:r>
-        <w:t>: Egyptian educational curriculum</w:t>
-      </w:r>
-      <w:r>
-        <w:t>:</w:t>
-      </w:r>
-      <w:r>
-        <w:t xml:space="preserve"> 2025</w:t>
-      </w:r>
-      <w:r>
-        <w:t xml:space="preserve"> - </w:t>
-      </w:r>
-      <w:r>
-        <w:t>2026</w:t>
+        <w:t>: Egyptian educational curriculum: 2025 - 2026</w:t>
       </w:r>
     </w:p>
     <w:p>
@@ -968,26 +920,7 @@
         <w:ind w:firstLine="720"/>
       </w:pPr>
     </w:p>
-    <w:p>
-      <w:pPr>
-        <w:ind w:firstLine="720"/>
-      </w:pPr>
-    </w:p>
-    <w:p>
-      <w:pPr>
-        <w:ind w:firstLine="720"/>
-      </w:pPr>
-    </w:p>
-    <w:p>
-      <w:pPr>
-        <w:ind w:firstLine="720"/>
-      </w:pPr>
-    </w:p>
-    <w:p>
-      <w:pPr>
-        <w:ind w:firstLine="720"/>
-      </w:pPr>
-    </w:p>
+    <w:p/>
     <w:p>
       <w:pPr>
         <w:pStyle w:val="ListParagraph"/>
@@ -997,50 +930,28 @@
         </w:numPr>
       </w:pPr>
       <w:r>
-        <w:t xml:space="preserve">* </w:t>
-      </w:r>
-      <w:r>
-        <w:rPr>
-          <w:b/>
+        <w:rPr>
+          <w:b/>
+        </w:rPr>
+        <w:t xml:space="preserve">* Source ID: </w:t>
+      </w:r>
+      <w:r>
+        <w:rPr>
           <w:bCs/>
         </w:rPr>
-        <w:t>Download Name</w:t>
-      </w:r>
-      <w:r>
-        <w:t xml:space="preserve">: </w:t>
-      </w:r>
-      <w:r>
-        <w:t>[</w:t>
-      </w:r>
-      <w:r>
-        <w:t>d18651cb-45ff-49b2-a275-976514daf3ae</w:t>
-      </w:r>
-      <w:r>
-        <w:t>.pdf</w:t>
-      </w:r>
-      <w:r>
-        <w:t xml:space="preserve"> </w:t>
-      </w:r>
-      <w:r>
-        <w:t xml:space="preserve">-&gt; </w:t>
-      </w:r>
-      <w:r>
-        <w:t>Arabic - Kg 1 - First Semester</w:t>
-      </w:r>
-      <w:r>
-        <w:t>.pdf</w:t>
-      </w:r>
-      <w:r>
-        <w:t>]</w:t>
-      </w:r>
-      <w:r>
-        <w:t xml:space="preserve"> [</w:t>
-      </w:r>
-      <w:r>
-        <w:t>Arabic - Kg 1 - First Semester</w:t>
-      </w:r>
-      <w:r>
-        <w:t>]</w:t>
+        <w:t>1</w:t>
+      </w:r>
+      <w:r>
+        <w:rPr>
+          <w:bCs/>
+        </w:rPr>
+        <w:t>0</w:t>
+      </w:r>
+      <w:r>
+        <w:rPr>
+          <w:bCs/>
+        </w:rPr>
+        <w:t>9</w:t>
       </w:r>
       <w:r>
         <w:br/>
@@ -1051,9 +962,21 @@
       <w:r>
         <w:rPr>
           <w:b/>
-          <w:bCs/>
-        </w:rPr>
-        <w:t>Download Type</w:t>
+        </w:rPr>
+        <w:t>Content Title</w:t>
+      </w:r>
+      <w:r>
+        <w:t>: [d18651cb-45ff-49b2-a275-976514daf3ae.pdf -&gt; Arabic - Kg 1 - First Semester.pdf] [Arabic - Kg 1 - First Semester]</w:t>
+      </w:r>
+      <w:r>
+        <w:br/>
+        <w:t xml:space="preserve">* </w:t>
+      </w:r>
+      <w:r>
+        <w:rPr>
+          <w:b/>
+        </w:rPr>
+        <w:t>Content Type</w:t>
       </w:r>
       <w:r>
         <w:t>: Document</w:t>
@@ -1069,65 +992,43 @@
       <w:r>
         <w:rPr>
           <w:b/>
-          <w:bCs/>
-        </w:rPr>
-        <w:t>Source Type</w:t>
+        </w:rPr>
+        <w:t>Domain</w:t>
       </w:r>
       <w:r>
         <w:t>: Educational</w:t>
       </w:r>
       <w:r>
-        <w:rPr>
-          <w:rtl/>
-        </w:rPr>
         <w:br/>
-      </w:r>
-      <w:r>
-        <w:t xml:space="preserve">* </w:t>
-      </w:r>
-      <w:r>
-        <w:rPr>
-          <w:b/>
-          <w:bCs/>
+        <w:t xml:space="preserve">* </w:t>
+      </w:r>
+      <w:r>
+        <w:rPr>
+          <w:b/>
         </w:rPr>
         <w:t>Source Platform</w:t>
       </w:r>
       <w:r>
-        <w:t xml:space="preserve">: </w:t>
-      </w:r>
-      <w:r>
-        <w:t>Egyptian Ministry of Education – E-Learning Portal (https://moe.gov.eg)</w:t>
-      </w:r>
-    </w:p>
-    <w:p>
-      <w:pPr>
-        <w:ind w:left="720"/>
-      </w:pPr>
-      <w:r>
-        <w:t xml:space="preserve">* </w:t>
-      </w:r>
-      <w:r>
-        <w:rPr>
-          <w:b/>
-          <w:bCs/>
-        </w:rPr>
-        <w:t>Download Source</w:t>
-      </w:r>
-      <w:r>
-        <w:t xml:space="preserve">: </w:t>
-      </w:r>
-      <w:hyperlink r:id="rId11" w:history="1">
-        <w:r>
-          <w:rPr>
-            <w:rStyle w:val="Hyperlink"/>
-          </w:rPr>
-          <w:t>https://moe.gov.eg/ar/elearningenterypage/e-learning/?schoolStageId=6959&amp;schoolYearId=6960&amp;schoolTermId=1584&amp;contentTypeId=7597&amp;pageIndex=0&amp;sortBy=0</w:t>
-        </w:r>
-      </w:hyperlink>
-      <w:r>
-        <w:t xml:space="preserve"> -&gt; </w:t>
-      </w:r>
-      <w:hyperlink r:id="rId12" w:history="1">
+        <w:t>: Egyptian Ministry of Education – E-Learning Portal (https://moe.gov.eg)</w:t>
+      </w:r>
+    </w:p>
+    <w:p>
+      <w:pPr>
+        <w:ind w:left="720"/>
+      </w:pPr>
+      <w:r>
+        <w:t xml:space="preserve">* </w:t>
+      </w:r>
+      <w:r>
+        <w:rPr>
+          <w:b/>
+        </w:rPr>
+        <w:t>Source Reference</w:t>
+      </w:r>
+      <w:r>
+        <w:t xml:space="preserve">: https://moe.gov.eg/ar/elearningenterypage/e-learning/?schoolStageId=6959&amp;schoolYearId=6960&amp;schoolTermId=1584&amp;contentTypeId=7597&amp;pageIndex=0&amp;sortBy=0 -&gt; </w:t>
+      </w:r>
+      <w:hyperlink r:id="rId8" w:history="1">
         <w:r>
           <w:rPr>
             <w:rStyle w:val="Hyperlink"/>
@@ -1136,10 +1037,50 @@
         </w:r>
       </w:hyperlink>
       <w:r>
+        <w:br/>
+      </w:r>
+      <w:r>
+        <w:t xml:space="preserve">* </w:t>
+      </w:r>
+      <w:r>
+        <w:rPr>
+          <w:b/>
+          <w:bCs/>
+        </w:rPr>
+        <w:t>Source Type</w:t>
+      </w:r>
+      <w:r>
+        <w:t xml:space="preserve">: </w:t>
+      </w:r>
+      <w:r>
+        <w:t>Downloaded</w:t>
+      </w:r>
+    </w:p>
+    <w:p>
+      <w:pPr>
+        <w:ind w:left="720"/>
+      </w:pPr>
+      <w:r>
+        <w:t xml:space="preserve">* </w:t>
+      </w:r>
+      <w:r>
+        <w:rPr>
+          <w:b/>
+          <w:bCs/>
+        </w:rPr>
+        <w:t>Source Nature:</w:t>
+      </w:r>
+      <w:r>
         <w:t xml:space="preserve"> </w:t>
       </w:r>
       <w:r>
-        <w:t xml:space="preserve"> </w:t>
+        <w:t>D</w:t>
+      </w:r>
+      <w:r>
+        <w:t>igital</w:t>
+      </w:r>
+      <w:r>
+        <w:t xml:space="preserve">  </w:t>
       </w:r>
     </w:p>
     <w:p>
@@ -1156,58 +1097,42 @@
       <w:r>
         <w:rPr>
           <w:b/>
-          <w:bCs/>
-        </w:rPr>
-        <w:t xml:space="preserve">Download </w:t>
-      </w:r>
-      <w:r>
-        <w:rPr>
-          <w:b/>
-          <w:bCs/>
-        </w:rPr>
-        <w:t>Server / Mirror</w:t>
-      </w:r>
-      <w:r>
-        <w:t xml:space="preserve">: </w:t>
-      </w:r>
-      <w:r>
-        <w:t>https://elearnningcontent.blob.core.windows.net [Microsoft Azure Blob Storage Server]</w:t>
-      </w:r>
-    </w:p>
-    <w:p>
-      <w:pPr>
-        <w:ind w:left="720"/>
-      </w:pPr>
-      <w:r>
-        <w:t xml:space="preserve">* </w:t>
-      </w:r>
-      <w:r>
-        <w:rPr>
-          <w:b/>
-          <w:bCs/>
-        </w:rPr>
-        <w:t>Download Method</w:t>
-      </w:r>
-      <w:r>
-        <w:t xml:space="preserve">: </w:t>
-      </w:r>
-      <w:r>
-        <w:t>Web Browser: Direct Save [Saved pdf directly from browser]</w:t>
-      </w:r>
-    </w:p>
-    <w:p>
-      <w:pPr>
-        <w:ind w:left="720"/>
-      </w:pPr>
-      <w:r>
-        <w:t xml:space="preserve">* </w:t>
-      </w:r>
-      <w:r>
-        <w:rPr>
-          <w:b/>
-          <w:bCs/>
-        </w:rPr>
-        <w:t>Download Format</w:t>
+        </w:rPr>
+        <w:t>Storage Host</w:t>
+      </w:r>
+      <w:r>
+        <w:t>: https://elearnningcontent.blob.core.windows.net [Microsoft Azure Blob Storage Server]</w:t>
+      </w:r>
+    </w:p>
+    <w:p>
+      <w:pPr>
+        <w:ind w:left="720"/>
+      </w:pPr>
+      <w:r>
+        <w:t xml:space="preserve">* </w:t>
+      </w:r>
+      <w:r>
+        <w:rPr>
+          <w:b/>
+        </w:rPr>
+        <w:t>Acquisition Method</w:t>
+      </w:r>
+      <w:r>
+        <w:t>: Web Browser: Direct Save [Saved pdf directly from browser]</w:t>
+      </w:r>
+    </w:p>
+    <w:p>
+      <w:pPr>
+        <w:ind w:left="720"/>
+      </w:pPr>
+      <w:r>
+        <w:t xml:space="preserve">* </w:t>
+      </w:r>
+      <w:r>
+        <w:rPr>
+          <w:b/>
+        </w:rPr>
+        <w:t>File Format</w:t>
       </w:r>
       <w:r>
         <w:t>: .pdf</w:t>
@@ -1223,9 +1148,8 @@
       <w:r>
         <w:rPr>
           <w:b/>
-          <w:bCs/>
-        </w:rPr>
-        <w:t>Download Quality</w:t>
+        </w:rPr>
+        <w:t>Content Quality</w:t>
       </w:r>
       <w:r>
         <w:t>: High</w:t>
@@ -1241,9 +1165,8 @@
       <w:r>
         <w:rPr>
           <w:b/>
-          <w:bCs/>
-        </w:rPr>
-        <w:t>Download Date</w:t>
+        </w:rPr>
+        <w:t>Acquisition Date</w:t>
       </w:r>
       <w:r>
         <w:t>: 8/13/2025</w:t>
@@ -1260,13 +1183,10 @@
         <w:rPr>
           <w:b/>
         </w:rPr>
-        <w:t>Saved Location</w:t>
-      </w:r>
-      <w:r>
-        <w:t xml:space="preserve">: </w:t>
-      </w:r>
-      <w:r>
-        <w:t>StorageType: Cloud -&gt; Platform: GitHub -&gt; Account: topicsscience -&gt; Repository: kingdomheartsknowledge -&gt; Path: Knowledge/1-Academic/1-school/..</w:t>
+        <w:t>Storage Location</w:t>
+      </w:r>
+      <w:r>
+        <w:t>: StorageType: Cloud -&gt; Platform: GitHub -&gt; Account: topicsscience -&gt; Repository: kingdomheartsknowledge -&gt; Path: Knowledge/1-Academic/1-school/..</w:t>
       </w:r>
     </w:p>
     <w:p>
@@ -1279,31 +1199,19 @@
       <w:r>
         <w:rPr>
           <w:b/>
-          <w:bCs/>
         </w:rPr>
         <w:t>Notes</w:t>
       </w:r>
       <w:r>
-        <w:t>: Egyptian educational curriculum</w:t>
-      </w:r>
-      <w:r>
-        <w:t>:</w:t>
-      </w:r>
-      <w:r>
-        <w:t xml:space="preserve"> 2025</w:t>
-      </w:r>
-      <w:r>
-        <w:t xml:space="preserve"> - </w:t>
-      </w:r>
-      <w:r>
-        <w:t>2026</w:t>
-      </w:r>
-    </w:p>
-    <w:p>
-      <w:r>
-        <w:br w:type="page"/>
-      </w:r>
-    </w:p>
+        <w:t>: Egyptian educational curriculum: 2025 - 2026</w:t>
+      </w:r>
+    </w:p>
+    <w:p/>
+    <w:p/>
+    <w:p/>
+    <w:p/>
+    <w:p/>
+    <w:p/>
     <w:p>
       <w:pPr>
         <w:pStyle w:val="ListParagraph"/>
@@ -1313,51 +1221,23 @@
         </w:numPr>
       </w:pPr>
       <w:r>
+        <w:rPr>
+          <w:b/>
+        </w:rPr>
         <w:lastRenderedPageBreak/>
-        <w:t xml:space="preserve">* </w:t>
-      </w:r>
-      <w:r>
-        <w:rPr>
-          <w:b/>
+        <w:t xml:space="preserve">* Source ID: </w:t>
+      </w:r>
+      <w:r>
+        <w:rPr>
           <w:bCs/>
         </w:rPr>
-        <w:t>Download Name</w:t>
-      </w:r>
-      <w:r>
-        <w:t xml:space="preserve">: </w:t>
-      </w:r>
-      <w:r>
-        <w:t>[</w:t>
-      </w:r>
-      <w:r>
-        <w:t>24075d65-0c34-4d20-9234-7c24f42b758d</w:t>
-      </w:r>
-      <w:r>
-        <w:t>.pdf</w:t>
-      </w:r>
-      <w:r>
-        <w:t xml:space="preserve"> </w:t>
-      </w:r>
-      <w:r>
-        <w:t xml:space="preserve">-&gt; </w:t>
-      </w:r>
-      <w:r>
-        <w:t>English - Kg 1 - First Semester</w:t>
-      </w:r>
-      <w:r>
-        <w:t>.pdf</w:t>
-      </w:r>
-      <w:r>
-        <w:t>]</w:t>
-      </w:r>
-      <w:r>
-        <w:t xml:space="preserve"> [</w:t>
-      </w:r>
-      <w:r>
-        <w:t>English - Kg 1 - First Semester</w:t>
-      </w:r>
-      <w:r>
-        <w:t>]</w:t>
+        <w:t>1</w:t>
+      </w:r>
+      <w:r>
+        <w:rPr>
+          <w:bCs/>
+        </w:rPr>
+        <w:t>10</w:t>
       </w:r>
       <w:r>
         <w:br/>
@@ -1368,9 +1248,21 @@
       <w:r>
         <w:rPr>
           <w:b/>
-          <w:bCs/>
-        </w:rPr>
-        <w:t>Download Type</w:t>
+        </w:rPr>
+        <w:t>Content Title</w:t>
+      </w:r>
+      <w:r>
+        <w:t>: [24075d65-0c34-4d20-9234-7c24f42b758d.pdf -&gt; English - Kg 1 - First Semester.pdf] [English - Kg 1 - First Semester]</w:t>
+      </w:r>
+      <w:r>
+        <w:br/>
+        <w:t xml:space="preserve">* </w:t>
+      </w:r>
+      <w:r>
+        <w:rPr>
+          <w:b/>
+        </w:rPr>
+        <w:t>Content Type</w:t>
       </w:r>
       <w:r>
         <w:t>: Document</w:t>
@@ -1386,65 +1278,43 @@
       <w:r>
         <w:rPr>
           <w:b/>
-          <w:bCs/>
-        </w:rPr>
-        <w:t>Source Type</w:t>
+        </w:rPr>
+        <w:t>Domain</w:t>
       </w:r>
       <w:r>
         <w:t>: Educational</w:t>
       </w:r>
       <w:r>
-        <w:rPr>
-          <w:rtl/>
-        </w:rPr>
         <w:br/>
-      </w:r>
-      <w:r>
-        <w:t xml:space="preserve">* </w:t>
-      </w:r>
-      <w:r>
-        <w:rPr>
-          <w:b/>
-          <w:bCs/>
+        <w:t xml:space="preserve">* </w:t>
+      </w:r>
+      <w:r>
+        <w:rPr>
+          <w:b/>
         </w:rPr>
         <w:t>Source Platform</w:t>
       </w:r>
       <w:r>
-        <w:t xml:space="preserve">: </w:t>
-      </w:r>
-      <w:r>
-        <w:t>Egyptian Ministry of Education – E-Learning Portal (https://moe.gov.eg)</w:t>
-      </w:r>
-    </w:p>
-    <w:p>
-      <w:pPr>
-        <w:ind w:left="720"/>
-      </w:pPr>
-      <w:r>
-        <w:t xml:space="preserve">* </w:t>
-      </w:r>
-      <w:r>
-        <w:rPr>
-          <w:b/>
-          <w:bCs/>
-        </w:rPr>
-        <w:t>Download Source</w:t>
-      </w:r>
-      <w:r>
-        <w:t xml:space="preserve">: </w:t>
-      </w:r>
-      <w:hyperlink r:id="rId13" w:history="1">
-        <w:r>
-          <w:rPr>
-            <w:rStyle w:val="Hyperlink"/>
-          </w:rPr>
-          <w:t>https://moe.gov.eg/ar/elearningenterypage/e-learning/?schoolStageId=6959&amp;schoolYearId=6960&amp;schoolTermId=1584&amp;contentTypeId=7597&amp;pageIndex=0&amp;sortBy=0</w:t>
-        </w:r>
-      </w:hyperlink>
-      <w:r>
-        <w:t xml:space="preserve"> -&gt; </w:t>
-      </w:r>
-      <w:hyperlink r:id="rId14" w:history="1">
+        <w:t>: Egyptian Ministry of Education – E-Learning Portal (https://moe.gov.eg)</w:t>
+      </w:r>
+    </w:p>
+    <w:p>
+      <w:pPr>
+        <w:ind w:left="720"/>
+      </w:pPr>
+      <w:r>
+        <w:t xml:space="preserve">* </w:t>
+      </w:r>
+      <w:r>
+        <w:rPr>
+          <w:b/>
+        </w:rPr>
+        <w:t>Source Reference</w:t>
+      </w:r>
+      <w:r>
+        <w:t xml:space="preserve">: https://moe.gov.eg/ar/elearningenterypage/e-learning/?schoolStageId=6959&amp;schoolYearId=6960&amp;schoolTermId=1584&amp;contentTypeId=7597&amp;pageIndex=0&amp;sortBy=0 -&gt; </w:t>
+      </w:r>
+      <w:hyperlink r:id="rId9" w:history="1">
         <w:r>
           <w:rPr>
             <w:rStyle w:val="Hyperlink"/>
@@ -1453,6 +1323,49 @@
         </w:r>
       </w:hyperlink>
       <w:r>
+        <w:br/>
+      </w:r>
+      <w:r>
+        <w:t xml:space="preserve">* </w:t>
+      </w:r>
+      <w:r>
+        <w:rPr>
+          <w:b/>
+          <w:bCs/>
+        </w:rPr>
+        <w:t>Source Type</w:t>
+      </w:r>
+      <w:r>
+        <w:t xml:space="preserve">: </w:t>
+      </w:r>
+      <w:r>
+        <w:t>Downloaded</w:t>
+      </w:r>
+    </w:p>
+    <w:p>
+      <w:pPr>
+        <w:ind w:left="720"/>
+      </w:pPr>
+      <w:r>
+        <w:t xml:space="preserve">* </w:t>
+      </w:r>
+      <w:r>
+        <w:rPr>
+          <w:b/>
+          <w:bCs/>
+        </w:rPr>
+        <w:t>Source Nature:</w:t>
+      </w:r>
+      <w:r>
+        <w:t xml:space="preserve"> </w:t>
+      </w:r>
+      <w:r>
+        <w:t>D</w:t>
+      </w:r>
+      <w:r>
+        <w:t>igital</w:t>
+      </w:r>
+      <w:r>
         <w:t xml:space="preserve"> </w:t>
       </w:r>
     </w:p>
@@ -1470,58 +1383,42 @@
       <w:r>
         <w:rPr>
           <w:b/>
-          <w:bCs/>
-        </w:rPr>
-        <w:t xml:space="preserve">Download </w:t>
-      </w:r>
-      <w:r>
-        <w:rPr>
-          <w:b/>
-          <w:bCs/>
-        </w:rPr>
-        <w:t>Server / Mirror</w:t>
-      </w:r>
-      <w:r>
-        <w:t xml:space="preserve">: </w:t>
-      </w:r>
-      <w:r>
-        <w:t>https://elearnningcontent.blob.core.windows.net [Microsoft Azure Blob Storage Server]</w:t>
-      </w:r>
-    </w:p>
-    <w:p>
-      <w:pPr>
-        <w:ind w:left="720"/>
-      </w:pPr>
-      <w:r>
-        <w:t xml:space="preserve">* </w:t>
-      </w:r>
-      <w:r>
-        <w:rPr>
-          <w:b/>
-          <w:bCs/>
-        </w:rPr>
-        <w:t>Download Method</w:t>
-      </w:r>
-      <w:r>
-        <w:t xml:space="preserve">: </w:t>
-      </w:r>
-      <w:r>
-        <w:t>Web Browser: Direct Save [Saved pdf directly from browser]</w:t>
-      </w:r>
-    </w:p>
-    <w:p>
-      <w:pPr>
-        <w:ind w:left="720"/>
-      </w:pPr>
-      <w:r>
-        <w:t xml:space="preserve">* </w:t>
-      </w:r>
-      <w:r>
-        <w:rPr>
-          <w:b/>
-          <w:bCs/>
-        </w:rPr>
-        <w:t>Download Format</w:t>
+        </w:rPr>
+        <w:t>Storage Host</w:t>
+      </w:r>
+      <w:r>
+        <w:t>: https://elearnningcontent.blob.core.windows.net [Microsoft Azure Blob Storage Server]</w:t>
+      </w:r>
+    </w:p>
+    <w:p>
+      <w:pPr>
+        <w:ind w:left="720"/>
+      </w:pPr>
+      <w:r>
+        <w:t xml:space="preserve">* </w:t>
+      </w:r>
+      <w:r>
+        <w:rPr>
+          <w:b/>
+        </w:rPr>
+        <w:t>Acquisition Method</w:t>
+      </w:r>
+      <w:r>
+        <w:t>: Web Browser: Direct Save [Saved pdf directly from browser]</w:t>
+      </w:r>
+    </w:p>
+    <w:p>
+      <w:pPr>
+        <w:ind w:left="720"/>
+      </w:pPr>
+      <w:r>
+        <w:t xml:space="preserve">* </w:t>
+      </w:r>
+      <w:r>
+        <w:rPr>
+          <w:b/>
+        </w:rPr>
+        <w:t>File Format</w:t>
       </w:r>
       <w:r>
         <w:t>: .pdf</w:t>
@@ -1537,9 +1434,8 @@
       <w:r>
         <w:rPr>
           <w:b/>
-          <w:bCs/>
-        </w:rPr>
-        <w:t>Download Quality</w:t>
+        </w:rPr>
+        <w:t>Content Quality</w:t>
       </w:r>
       <w:r>
         <w:t>: High</w:t>
@@ -1555,9 +1451,8 @@
       <w:r>
         <w:rPr>
           <w:b/>
-          <w:bCs/>
-        </w:rPr>
-        <w:t>Download Date</w:t>
+        </w:rPr>
+        <w:t>Acquisition Date</w:t>
       </w:r>
       <w:r>
         <w:t>: 8/13/2025</w:t>
@@ -1574,13 +1469,10 @@
         <w:rPr>
           <w:b/>
         </w:rPr>
-        <w:t>Saved Location</w:t>
-      </w:r>
-      <w:r>
-        <w:t xml:space="preserve">: </w:t>
-      </w:r>
-      <w:r>
-        <w:t>StorageType: Cloud -&gt; Platform: GitHub -&gt; Account: topicsscience -&gt; Repository: kingdomheartsknowledge -&gt; Path: Knowledge/1-Academic/1-school/..</w:t>
+        <w:t>Storage Location</w:t>
+      </w:r>
+      <w:r>
+        <w:t>: StorageType: Cloud -&gt; Platform: GitHub -&gt; Account: topicsscience -&gt; Repository: kingdomheartsknowledge -&gt; Path: Knowledge/1-Academic/1-school/..</w:t>
       </w:r>
     </w:p>
     <w:p>
@@ -1593,24 +1485,11 @@
       <w:r>
         <w:rPr>
           <w:b/>
-          <w:bCs/>
         </w:rPr>
         <w:t>Notes</w:t>
       </w:r>
       <w:r>
-        <w:t>: Egyptian educational curriculum</w:t>
-      </w:r>
-      <w:r>
-        <w:t>:</w:t>
-      </w:r>
-      <w:r>
-        <w:t xml:space="preserve"> 2025</w:t>
-      </w:r>
-      <w:r>
-        <w:t xml:space="preserve"> - </w:t>
-      </w:r>
-      <w:r>
-        <w:t>2026</w:t>
+        <w:t>: Egyptian educational curriculum: 2025 - 2026</w:t>
       </w:r>
     </w:p>
     <w:p>
@@ -2610,7 +2489,7 @@
   <w:style w:type="paragraph" w:default="1" w:styleId="Normal">
     <w:name w:val="Normal"/>
     <w:qFormat/>
-    <w:rsid w:val="004F71E7"/>
+    <w:rsid w:val="00151C02"/>
   </w:style>
   <w:style w:type="paragraph" w:styleId="Heading1">
     <w:name w:val="heading 1"/>

</xml_diff>